<commit_message>
Speed up bulk resume ingest: parallel extraction, batched embeddings, faster OCR resolution
</commit_message>
<xml_diff>
--- a/sample_data/resumes/mentees/lee_jordan.docx
+++ b/sample_data/resumes/mentees/lee_jordan.docx
@@ -10,6 +10,11 @@
     <w:p>
       <w:r>
         <w:t>Software Engineer II — Engineering</w:t>
+      </w:r>
+    </w:p>
+    <w:p>
+      <w:r>
+        <w:t>jordan.lee@example.com</w:t>
       </w:r>
     </w:p>
     <w:p>

</xml_diff>